<commit_message>
Consolida propuesta de tutoría y alinea decisión de persistencia
Corrige duplicados y contradicciones en la propuesta de tutoría,
alinea README y documento unificado con la decisión abierta entre
Firebase y Supabase, y agrega la propuesta de tutoría al repositorio.
</commit_message>
<xml_diff>
--- a/TRABAJO FINAL INTEGRADOR - unificado.docx
+++ b/TRABAJO FINAL INTEGRADOR - unificado.docx
@@ -251,11 +251,7 @@
     </w:p>
     <w:p>
       <w:r>
-        <w:lastRenderedPageBreak/>
-        <w:t>La arquitectura propuesta implementa un enfoque híbrido de persistencia de datos (PostgreSQL para transacciones ACID y MongoDB para catálogo dinámico y logs) y una interfaz frontend moderna, reactiva y pensada para el uso diario de técnicos y rec</w:t>
-      </w:r>
-      <w:r>
-        <w:t>epcionistas, no solo de administradores.</w:t>
+        <w:t>La arquitectura propuesta se apoya en un backend desacoplado y un servicio de persistencia gestionado — hoy evaluamos Firebase y Supabase, sopesando ventajas y desventajas de cada uno — junto con una interfaz frontend moderna, reactiva y pensada para el uso diario de técnicos y recepcionistas, no solo de administradores.</w:t>
       </w:r>
     </w:p>
     <w:p/>
@@ -754,10 +750,7 @@
     </w:p>
     <w:p>
       <w:r>
-        <w:t>La solución se basará en una arquitectura desacoplada</w:t>
-      </w:r>
-      <w:r>
-        <w:t xml:space="preserve"> (Frontend / Backend API REST / Persistencia Híbrida) para garantizar mantenibilidad, escalabilidad y buenas prácticas de ingeniería de software.</w:t>
+        <w:t>La solución se basará en una arquitectura desacoplada (Frontend / Backend API REST / Persistencia mediante un servicio gestionado, aún en evaluación) para garantizar mantenibilidad, escalabilidad y buenas prácticas de ingeniería de software.</w:t>
       </w:r>
     </w:p>
     <w:p>
@@ -835,7 +828,7 @@
         <w:rPr>
           <w:b/>
         </w:rPr>
-        <w:t>Bases de Datos (Modelo Híbrido — Polyglot Persistence):</w:t>
+        <w:t>Base de Datos (Servicio Gestionado — Decisión en Evaluación):</w:t>
       </w:r>
     </w:p>
     <w:p>
@@ -843,7 +836,7 @@
         <w:pStyle w:val="Listaconvietas"/>
       </w:pPr>
       <w:r>
-        <w:t>Relacional (PostgreSQL): entidades transaccionales con restricciones ACID (Órdenes, Ventas, Saldos, Usuarios, Clientes, tablas maestras).</w:t>
+        <w:t>Firebase: base de datos NoSQL (Firestore) con autenticación, hosting y funciones serverless integradas en un mismo ecosistema; evaluamos su velocidad de desarrollo frente a la rigidez de su modelo de consultas para reportes relacionales complejos.</w:t>
       </w:r>
     </w:p>
     <w:p>
@@ -851,11 +844,7 @@
         <w:pStyle w:val="Listaconvietas"/>
       </w:pPr>
       <w:r>
-        <w:lastRenderedPageBreak/>
-        <w:t>NoSQL orientada a documentos (MongoDB): catálogo din</w:t>
-      </w:r>
-      <w:r>
-        <w:t>ámico de especificaciones técnicas de equipos/repuestos, logs de auditoría y registros no estructurados (cumpliendo la integración con Base de Datos II).</w:t>
+        <w:t>Supabase: base de datos relacional (PostgreSQL) con autenticación y APIs autogeneradas; evaluamos su compatibilidad con SQL estándar y restricciones ACID frente a la necesidad de definir manualmente el modelo de datos.</w:t>
       </w:r>
     </w:p>
     <w:p>
@@ -890,7 +879,7 @@
         <w:pStyle w:val="Listaconvietas"/>
       </w:pPr>
       <w:r>
-        <w:t>Database Cloud: MongoDB Atlas y Supabase/Aiven para PostgreSQL.</w:t>
+        <w:t>Database Cloud: Firebase o Supabase, según la decisión que consolidemos antes de la 2.ª entrega (27/09).</w:t>
       </w:r>
     </w:p>
     <w:p/>

</xml_diff>